<commit_message>
hoan thanh cau 5
</commit_message>
<xml_diff>
--- a/cau2.docx
+++ b/cau2.docx
@@ -826,6 +826,285 @@
         <w:t xml:space="preserve"> 2 commit.</w:t>
       </w:r>
     </w:p>
+    <w:p>
+      <w:proofErr w:type="spellStart"/>
+      <w:r>
+        <w:t>Câu</w:t>
+      </w:r>
+      <w:proofErr w:type="spellEnd"/>
+      <w:r>
+        <w:t xml:space="preserve"> </w:t>
+      </w:r>
+      <w:proofErr w:type="spellStart"/>
+      <w:proofErr w:type="gramStart"/>
+      <w:r>
+        <w:t>hỏi</w:t>
+      </w:r>
+      <w:proofErr w:type="spellEnd"/>
+      <w:r>
+        <w:t xml:space="preserve"> :</w:t>
+      </w:r>
+      <w:proofErr w:type="gramEnd"/>
+      <w:r>
+        <w:t xml:space="preserve"> </w:t>
+      </w:r>
+      <w:proofErr w:type="spellStart"/>
+      <w:r>
+        <w:t>để</w:t>
+      </w:r>
+      <w:proofErr w:type="spellEnd"/>
+      <w:r>
+        <w:t xml:space="preserve"> </w:t>
+      </w:r>
+      <w:proofErr w:type="spellStart"/>
+      <w:r>
+        <w:t>chạy</w:t>
+      </w:r>
+      <w:proofErr w:type="spellEnd"/>
+      <w:r>
+        <w:t xml:space="preserve"> file DH52201766.cpp </w:t>
+      </w:r>
+      <w:proofErr w:type="spellStart"/>
+      <w:r>
+        <w:t>và</w:t>
+      </w:r>
+      <w:proofErr w:type="spellEnd"/>
+      <w:r>
+        <w:t xml:space="preserve"> DH52201766.sh</w:t>
+      </w:r>
+    </w:p>
+    <w:p>
+      <w:pPr>
+        <w:tabs>
+          <w:tab w:val="left" w:pos="916"/>
+          <w:tab w:val="left" w:pos="1832"/>
+          <w:tab w:val="left" w:pos="2748"/>
+          <w:tab w:val="left" w:pos="3664"/>
+          <w:tab w:val="left" w:pos="4580"/>
+          <w:tab w:val="left" w:pos="5496"/>
+          <w:tab w:val="left" w:pos="6412"/>
+          <w:tab w:val="left" w:pos="7328"/>
+          <w:tab w:val="left" w:pos="8244"/>
+          <w:tab w:val="left" w:pos="9160"/>
+          <w:tab w:val="left" w:pos="10076"/>
+          <w:tab w:val="left" w:pos="10992"/>
+          <w:tab w:val="left" w:pos="11908"/>
+          <w:tab w:val="left" w:pos="12824"/>
+          <w:tab w:val="left" w:pos="13740"/>
+          <w:tab w:val="left" w:pos="14656"/>
+        </w:tabs>
+        <w:spacing w:after="0" w:line="240" w:lineRule="auto"/>
+        <w:rPr>
+          <w:rFonts w:ascii="Courier New" w:eastAsia="Times New Roman" w:hAnsi="Courier New" w:cs="Courier New"/>
+          <w:kern w:val="0"/>
+          <w:sz w:val="20"/>
+          <w:szCs w:val="20"/>
+          <w14:ligatures w14:val="none"/>
+        </w:rPr>
+      </w:pPr>
+      <w:r>
+        <w:t xml:space="preserve">DH52201766.cpp ta dung </w:t>
+      </w:r>
+      <w:proofErr w:type="spellStart"/>
+      <w:r>
+        <w:t>lệnh</w:t>
+      </w:r>
+      <w:proofErr w:type="spellEnd"/>
+      <w:r>
+        <w:t xml:space="preserve">: </w:t>
+      </w:r>
+      <w:r>
+        <w:rPr>
+          <w:rFonts w:ascii="Courier New" w:eastAsia="Times New Roman" w:hAnsi="Courier New" w:cs="Courier New"/>
+          <w:kern w:val="0"/>
+          <w:sz w:val="20"/>
+          <w:szCs w:val="20"/>
+          <w14:ligatures w14:val="none"/>
+        </w:rPr>
+        <w:t xml:space="preserve">g++ </w:t>
+      </w:r>
+      <w:r>
+        <w:rPr>
+          <w:rFonts w:ascii="Courier New" w:eastAsia="Times New Roman" w:hAnsi="Courier New" w:cs="Courier New"/>
+          <w:kern w:val="0"/>
+          <w:sz w:val="20"/>
+          <w:szCs w:val="20"/>
+          <w14:ligatures w14:val="none"/>
+        </w:rPr>
+        <w:t>DH52201766</w:t>
+      </w:r>
+      <w:r>
+        <w:rPr>
+          <w:rFonts w:ascii="Courier New" w:eastAsia="Times New Roman" w:hAnsi="Courier New" w:cs="Courier New"/>
+          <w:kern w:val="0"/>
+          <w:sz w:val="20"/>
+          <w:szCs w:val="20"/>
+          <w14:ligatures w14:val="none"/>
+        </w:rPr>
+        <w:t>.cpp -o test</w:t>
+      </w:r>
+    </w:p>
+    <w:p>
+      <w:pPr>
+        <w:tabs>
+          <w:tab w:val="left" w:pos="916"/>
+          <w:tab w:val="left" w:pos="1832"/>
+          <w:tab w:val="left" w:pos="2748"/>
+          <w:tab w:val="left" w:pos="3664"/>
+          <w:tab w:val="left" w:pos="4580"/>
+          <w:tab w:val="left" w:pos="5496"/>
+          <w:tab w:val="left" w:pos="6412"/>
+          <w:tab w:val="left" w:pos="7328"/>
+          <w:tab w:val="left" w:pos="8244"/>
+          <w:tab w:val="left" w:pos="9160"/>
+          <w:tab w:val="left" w:pos="10076"/>
+          <w:tab w:val="left" w:pos="10992"/>
+          <w:tab w:val="left" w:pos="11908"/>
+          <w:tab w:val="left" w:pos="12824"/>
+          <w:tab w:val="left" w:pos="13740"/>
+          <w:tab w:val="left" w:pos="14656"/>
+        </w:tabs>
+        <w:spacing w:after="0" w:line="240" w:lineRule="auto"/>
+        <w:rPr>
+          <w:rFonts w:ascii="Courier New" w:eastAsia="Times New Roman" w:hAnsi="Courier New" w:cs="Courier New"/>
+          <w:kern w:val="0"/>
+          <w:sz w:val="20"/>
+          <w:szCs w:val="20"/>
+          <w14:ligatures w14:val="none"/>
+        </w:rPr>
+      </w:pPr>
+      <w:proofErr w:type="gramStart"/>
+      <w:r>
+        <w:rPr>
+          <w:rFonts w:ascii="Courier New" w:eastAsia="Times New Roman" w:hAnsi="Courier New" w:cs="Courier New"/>
+          <w:kern w:val="0"/>
+          <w:sz w:val="20"/>
+          <w:szCs w:val="20"/>
+          <w14:ligatures w14:val="none"/>
+        </w:rPr>
+        <w:t>./</w:t>
+      </w:r>
+      <w:proofErr w:type="gramEnd"/>
+      <w:r>
+        <w:rPr>
+          <w:rFonts w:ascii="Courier New" w:eastAsia="Times New Roman" w:hAnsi="Courier New" w:cs="Courier New"/>
+          <w:kern w:val="0"/>
+          <w:sz w:val="20"/>
+          <w:szCs w:val="20"/>
+          <w14:ligatures w14:val="none"/>
+        </w:rPr>
+        <w:t>test</w:t>
+      </w:r>
+    </w:p>
+    <w:p>
+      <w:pPr>
+        <w:tabs>
+          <w:tab w:val="left" w:pos="916"/>
+          <w:tab w:val="left" w:pos="1832"/>
+          <w:tab w:val="left" w:pos="2748"/>
+          <w:tab w:val="left" w:pos="3664"/>
+          <w:tab w:val="left" w:pos="4580"/>
+          <w:tab w:val="left" w:pos="5496"/>
+          <w:tab w:val="left" w:pos="6412"/>
+          <w:tab w:val="left" w:pos="7328"/>
+          <w:tab w:val="left" w:pos="8244"/>
+          <w:tab w:val="left" w:pos="9160"/>
+          <w:tab w:val="left" w:pos="10076"/>
+          <w:tab w:val="left" w:pos="10992"/>
+          <w:tab w:val="left" w:pos="11908"/>
+          <w:tab w:val="left" w:pos="12824"/>
+          <w:tab w:val="left" w:pos="13740"/>
+          <w:tab w:val="left" w:pos="14656"/>
+        </w:tabs>
+        <w:spacing w:after="0" w:line="240" w:lineRule="auto"/>
+        <w:rPr>
+          <w:rFonts w:ascii="Courier New" w:eastAsia="Times New Roman" w:hAnsi="Courier New" w:cs="Courier New"/>
+          <w:kern w:val="0"/>
+          <w:sz w:val="20"/>
+          <w:szCs w:val="20"/>
+          <w14:ligatures w14:val="none"/>
+        </w:rPr>
+      </w:pPr>
+      <w:r>
+        <w:t xml:space="preserve">DH52201766.sh ta dung </w:t>
+      </w:r>
+      <w:proofErr w:type="spellStart"/>
+      <w:proofErr w:type="gramStart"/>
+      <w:r>
+        <w:t>lệnh</w:t>
+      </w:r>
+      <w:proofErr w:type="spellEnd"/>
+      <w:r>
+        <w:t xml:space="preserve"> :</w:t>
+      </w:r>
+      <w:proofErr w:type="gramEnd"/>
+      <w:r>
+        <w:t xml:space="preserve"> </w:t>
+      </w:r>
+      <w:proofErr w:type="spellStart"/>
+      <w:r>
+        <w:rPr>
+          <w:rFonts w:ascii="Courier New" w:eastAsia="Times New Roman" w:hAnsi="Courier New" w:cs="Courier New"/>
+          <w:kern w:val="0"/>
+          <w:sz w:val="20"/>
+          <w:szCs w:val="20"/>
+          <w14:ligatures w14:val="none"/>
+        </w:rPr>
+        <w:t>chmod</w:t>
+      </w:r>
+      <w:proofErr w:type="spellEnd"/>
+      <w:r>
+        <w:rPr>
+          <w:rFonts w:ascii="Courier New" w:eastAsia="Times New Roman" w:hAnsi="Courier New" w:cs="Courier New"/>
+          <w:kern w:val="0"/>
+          <w:sz w:val="20"/>
+          <w:szCs w:val="20"/>
+          <w14:ligatures w14:val="none"/>
+        </w:rPr>
+        <w:t xml:space="preserve"> +x 12345678.sh</w:t>
+      </w:r>
+    </w:p>
+    <w:p>
+      <w:pPr>
+        <w:tabs>
+          <w:tab w:val="left" w:pos="916"/>
+          <w:tab w:val="left" w:pos="1832"/>
+          <w:tab w:val="left" w:pos="2748"/>
+          <w:tab w:val="left" w:pos="3664"/>
+          <w:tab w:val="left" w:pos="4580"/>
+          <w:tab w:val="left" w:pos="5496"/>
+          <w:tab w:val="left" w:pos="6412"/>
+          <w:tab w:val="left" w:pos="7328"/>
+          <w:tab w:val="left" w:pos="8244"/>
+          <w:tab w:val="left" w:pos="9160"/>
+          <w:tab w:val="left" w:pos="10076"/>
+          <w:tab w:val="left" w:pos="10992"/>
+          <w:tab w:val="left" w:pos="11908"/>
+          <w:tab w:val="left" w:pos="12824"/>
+          <w:tab w:val="left" w:pos="13740"/>
+          <w:tab w:val="left" w:pos="14656"/>
+        </w:tabs>
+        <w:spacing w:after="0" w:line="240" w:lineRule="auto"/>
+        <w:rPr>
+          <w:rFonts w:ascii="Courier New" w:eastAsia="Times New Roman" w:hAnsi="Courier New" w:cs="Courier New"/>
+          <w:kern w:val="0"/>
+          <w:sz w:val="20"/>
+          <w:szCs w:val="20"/>
+          <w14:ligatures w14:val="none"/>
+        </w:rPr>
+      </w:pPr>
+      <w:r>
+        <w:rPr>
+          <w:rFonts w:ascii="Courier New" w:eastAsia="Times New Roman" w:hAnsi="Courier New" w:cs="Courier New"/>
+          <w:kern w:val="0"/>
+          <w:sz w:val="20"/>
+          <w:szCs w:val="20"/>
+          <w14:ligatures w14:val="none"/>
+        </w:rPr>
+        <w:t>./12345678.sh</w:t>
+      </w:r>
+    </w:p>
+    <w:p/>
     <w:p/>
     <w:sectPr>
       <w:pgSz w:w="12240" w:h="15840"/>

</xml_diff>